<commit_message>
revised intro and discussion
</commit_message>
<xml_diff>
--- a/text/custom-reference.docx
+++ b/text/custom-reference.docx
@@ -5,9 +5,6 @@
     <w:p>
       <w:pPr>
         <w:pStyle w:val="BodyText"/>
-        <w:rPr>
-          <w:szCs w:val="24"/>
-        </w:rPr>
       </w:pPr>
     </w:p>
     <w:sectPr>
@@ -831,9 +828,10 @@
     <w:name w:val="Body Text"/>
     <w:basedOn w:val="Normal"/>
     <w:qFormat/>
-    <w:rsid w:val="00483AFC"/>
+    <w:rsid w:val="007D6EB2"/>
     <w:pPr>
       <w:spacing w:after="0" w:line="480" w:lineRule="auto"/>
+      <w:ind w:firstLine="720"/>
     </w:pPr>
     <w:rPr>
       <w:sz w:val="24"/>

</xml_diff>